<commit_message>
feat: implement village-wise shared data access, dual-query resilience, and profile auto-healing
</commit_message>
<xml_diff>
--- a/PROJECT_MASTER_DOCUMENTATION.docx
+++ b/PROJECT_MASTER_DOCUMENTATION.docx
@@ -1557,7 +1557,125 @@
           <w:color w:val="0D5E45"/>
           <w:sz w:val="32"/>
         </w:rPr>
-        <w:t>6. Chronological Git Commit History &amp; Release Milestones</w:t>
+        <w:t>6. Village-Wise Shared Data Access — Automatic for Assigned Surveyors</w:t>
+      </w:r>
+    </w:p>
+    <w:p>
+      <w:pPr>
+        <w:spacing w:after="80"/>
+      </w:pPr>
+      <w:r>
+        <w:t>Under the Village-Wise Shared Data Access architecture, the primary security boundary is the village unit (villageId) rather than the individual record creator (createdBy). Key architectural principles:</w:t>
+      </w:r>
+    </w:p>
+    <w:p>
+      <w:pPr>
+        <w:pStyle w:val="ListBullet"/>
+        <w:spacing w:before="20" w:after="40"/>
+      </w:pPr>
+      <w:r>
+        <w:rPr>
+          <w:b/>
+          <w:color w:val="1E293B"/>
+        </w:rPr>
+        <w:t xml:space="preserve">Automatic Retrospective &amp; Future Access: </w:t>
+      </w:r>
+      <w:r>
+        <w:rPr>
+          <w:color w:val="334155"/>
+        </w:rPr>
+        <w:t>Assigning a village (e.g., Samodi) to a surveyor automatically grants immediate access to ALL existing historical records previously submitted by other surveyors, as well as all future records, without record duplication.</w:t>
+      </w:r>
+    </w:p>
+    <w:p>
+      <w:pPr>
+        <w:pStyle w:val="ListBullet"/>
+        <w:spacing w:before="20" w:after="40"/>
+      </w:pPr>
+      <w:r>
+        <w:rPr>
+          <w:b/>
+          <w:color w:val="1E293B"/>
+        </w:rPr>
+        <w:t xml:space="preserve">Audit Field Preservation: </w:t>
+      </w:r>
+      <w:r>
+        <w:rPr>
+          <w:color w:val="334155"/>
+        </w:rPr>
+        <w:t>Fields such as createdBy, createdByName, createdAt, updatedBy, and surveyorId are strictly preserved for audit trails and surveyor contribution metrics.</w:t>
+      </w:r>
+    </w:p>
+    <w:p>
+      <w:pPr>
+        <w:pStyle w:val="ListBullet"/>
+        <w:spacing w:before="20" w:after="40"/>
+      </w:pPr>
+      <w:r>
+        <w:rPr>
+          <w:b/>
+          <w:color w:val="1E293B"/>
+        </w:rPr>
+        <w:t xml:space="preserve">Unassigned Surveyor Isolation: </w:t>
+      </w:r>
+      <w:r>
+        <w:rPr>
+          <w:color w:val="334155"/>
+        </w:rPr>
+        <w:t>Surveyors without assigned villages have zero record access. Revoking a village assignment cuts off access immediately without altering the underlying village records.</w:t>
+      </w:r>
+    </w:p>
+    <w:p>
+      <w:pPr>
+        <w:pStyle w:val="ListBullet"/>
+        <w:spacing w:before="20" w:after="40"/>
+      </w:pPr>
+      <w:r>
+        <w:rPr>
+          <w:b/>
+          <w:color w:val="1E293B"/>
+        </w:rPr>
+        <w:t xml:space="preserve">View-Only Role Protection: </w:t>
+      </w:r>
+      <w:r>
+        <w:rPr>
+          <w:color w:val="334155"/>
+        </w:rPr>
+        <w:t>Surveyors with isReadOnly: true can view, search, and print dossiers, but cannot add, edit, or delete records. This is enforced in both UI pages and firestore.rules.</w:t>
+      </w:r>
+    </w:p>
+    <w:p>
+      <w:pPr>
+        <w:pStyle w:val="ListBullet"/>
+        <w:spacing w:before="20" w:after="40"/>
+      </w:pPr>
+      <w:r>
+        <w:rPr>
+          <w:b/>
+          <w:color w:val="1E293B"/>
+        </w:rPr>
+        <w:t xml:space="preserve">Canonical Village IDs &amp; Migration: </w:t>
+      </w:r>
+      <w:r>
+        <w:rPr>
+          <w:color w:val="334155"/>
+        </w:rPr>
+        <w:t>Records are canonicalized via resolveVillageId(). Unambiguous legacy records missing villageId are auto-migrated. Ambiguous records are never guessed; they are flagged for Admin review.</w:t>
+      </w:r>
+    </w:p>
+    <w:p>
+      <w:pPr>
+        <w:keepNext/>
+        <w:spacing w:before="320" w:after="120"/>
+      </w:pPr>
+      <w:r>
+        <w:rPr>
+          <w:rFonts w:ascii="Calibri" w:hAnsi="Calibri"/>
+          <w:b/>
+          <w:color w:val="0D5E45"/>
+          <w:sz w:val="32"/>
+        </w:rPr>
+        <w:t>7. Chronological Git Commit History &amp; Release Milestones</w:t>
       </w:r>
     </w:p>
     <w:tbl>
@@ -1680,7 +1798,7 @@
                 <w:b/>
                 <w:sz w:val="17"/>
               </w:rPr>
-              <w:t>fix(print): portal print document to body and hide root; remove dummy data; modernize mobile bottom bar</w:t>
+              <w:t>feat: implement village-wise shared data access, automated surveyor permissions, and legacy migration</w:t>
             </w:r>
           </w:p>
         </w:tc>
@@ -1701,7 +1819,7 @@
                 <w:color w:val="475569"/>
                 <w:sz w:val="17"/>
               </w:rPr>
-              <w:t>Current Release: Fixed printing bug, completely eliminated mock generators and UI toggles, redesigned floating capsule mobile taskbar.</w:t>
+              <w:t>Latest Milestone: Implemented villageId primary scoping, real-time shared surveyor access, view-only enforcement, and Admin migration.</w:t>
             </w:r>
           </w:p>
         </w:tc>
@@ -1747,7 +1865,7 @@
                 <w:b/>
                 <w:sz w:val="17"/>
               </w:rPr>
-              <w:t>feat: add on-demand dummy data toggle feature for demo preview</w:t>
+              <w:t>fix(print): portal print document to body and hide root; remove dummy data; modernize mobile bottom bar</w:t>
             </w:r>
           </w:p>
         </w:tc>
@@ -1768,7 +1886,7 @@
                 <w:color w:val="475569"/>
                 <w:sz w:val="17"/>
               </w:rPr>
-              <w:t>Temporary demo toggle feature (now removed in production).</w:t>
+              <w:t>Production release: Fixed printing bug, eliminated mock generators, redesigned floating capsule mobile taskbar.</w:t>
             </w:r>
           </w:p>
         </w:tc>
@@ -2930,7 +3048,7 @@
           <w:color w:val="0D5E45"/>
           <w:sz w:val="32"/>
         </w:rPr>
-        <w:t>7. Rules of Engagement for Future AI Coding Assistants</w:t>
+        <w:t>8. Rules of Engagement for Future AI Coding Assistants</w:t>
       </w:r>
     </w:p>
     <w:p>
@@ -3026,6 +3144,63 @@
           <w:color w:val="334155"/>
         </w:rPr>
         <w:t>The app uses a hybrid caching strategy where onSnapshot synchronizes to React state and useLocalStorage ensures smooth offline loading.</w:t>
+      </w:r>
+    </w:p>
+    <w:p>
+      <w:pPr>
+        <w:pStyle w:val="ListBullet"/>
+        <w:spacing w:before="20" w:after="40"/>
+      </w:pPr>
+      <w:r>
+        <w:rPr>
+          <w:b/>
+          <w:color w:val="1E293B"/>
+        </w:rPr>
+        <w:t xml:space="preserve">6. VILLAGE SCOPING INVARIANCE: </w:t>
+      </w:r>
+      <w:r>
+        <w:rPr>
+          <w:color w:val="334155"/>
+        </w:rPr>
+        <w:t>Always preserve village-level data scoping (villageId). Surveyors access all records in their assigned village(s) regardless of who created them.</w:t>
+      </w:r>
+    </w:p>
+    <w:p>
+      <w:pPr>
+        <w:pStyle w:val="ListBullet"/>
+        <w:spacing w:before="20" w:after="40"/>
+      </w:pPr>
+      <w:r>
+        <w:rPr>
+          <w:b/>
+          <w:color w:val="1E293B"/>
+        </w:rPr>
+        <w:t xml:space="preserve">7. VIEW-ONLY ROLE ENFORCEMENT: </w:t>
+      </w:r>
+      <w:r>
+        <w:rPr>
+          <w:color w:val="334155"/>
+        </w:rPr>
+        <w:t>Strictly preserve read-only restrictions for surveyors with isReadOnly: true across all forms and firestore.rules.</w:t>
+      </w:r>
+    </w:p>
+    <w:p>
+      <w:pPr>
+        <w:pStyle w:val="ListBullet"/>
+        <w:spacing w:before="20" w:after="40"/>
+      </w:pPr>
+      <w:r>
+        <w:rPr>
+          <w:b/>
+          <w:color w:val="1E293B"/>
+        </w:rPr>
+        <w:t xml:space="preserve">8. AUDIT FIELD INTEGRITY: </w:t>
+      </w:r>
+      <w:r>
+        <w:rPr>
+          <w:color w:val="334155"/>
+        </w:rPr>
+        <w:t>Preserve createdBy, createdAt, updatedBy, and surveyorId for audit tracking.</w:t>
       </w:r>
     </w:p>
     <w:sectPr>

</xml_diff>